<commit_message>
feat(mobile): remove the time zone setting; dates follow the phone (D-101)
Co-Authored-By: Claude Opus 5.5 <noreply@anthropic.com>
</commit_message>
<xml_diff>
--- a/docs/requirements/Brokely_Software_Requirements_Specification_v1.7.docx
+++ b/docs/requirements/Brokely_Software_Requirements_Specification_v1.7.docx
@@ -1391,7 +1391,7 @@
                 <w:sz w:val="19"/>
                 <w:szCs w:val="19"/>
               </w:rPr>
-              <w:t>Built app brought into the requirements (D-28 to D-97, R-14). New: daily guide and left to spend today on Home (D-58, D-95), category heads-up in Insights (D-96), dark mode (D-32), account linking rules (D-73, D-83), debts from before in quick start (D-41), suggestions never set amounts (D-46), money tips (D-67), privacy notice, terms and no Android Auto Backup (D-92, D-93, D-97). Notifications move to 0.1 (D-94). New FR-ACC-08, FR-ACC-09, FR-PLN-22, FR-PLN-23, FR-TXN-12, FR-INS-09 to 11, FR-NOT-08, FR-NOT-09, BR-32 to BR-35, NFR-21, NFR-22, AC-64 to AC-70. Changed: FR-PLN-05, FR-CAT-01, FR-MAS-01, FR-MAS-08, FR-NOT-01 to 07, NFR-06, NFR-20, AC-02, AC-54. See section 15. Same day, after a phone review: the today card switches to the amount a day from tomorrow once today is over, and the ring turns red past the budget (D-98, new FR-INS-12, AC-71); the wallet check is removed to keep 0.1 small (D-99: FR-WAL-01 to 04, BR-30, BR-31, AC-62, AC-63 removed).</w:t>
+              <w:t>Built app brought into the requirements (D-28 to D-97, R-14). New: daily guide and left to spend today on Home (D-58, D-95), category heads-up in Insights (D-96), dark mode (D-32), account linking rules (D-73, D-83), debts from before in quick start (D-41), suggestions never set amounts (D-46), money tips (D-67), privacy notice, terms and no Android Auto Backup (D-92, D-93, D-97). Notifications move to 0.1 (D-94). New FR-ACC-08, FR-ACC-09, FR-PLN-22, FR-PLN-23, FR-TXN-12, FR-INS-09 to 11, FR-NOT-08, FR-NOT-09, BR-32 to BR-35, NFR-21, NFR-22, AC-64 to AC-70. Changed: FR-PLN-05, FR-CAT-01, FR-MAS-01, FR-MAS-08, FR-NOT-01 to 07, NFR-06, NFR-20, AC-02, AC-54. See section 15. Same day, after a phone review: the today card switches to the amount a day from tomorrow once today is over, and the ring turns red past the budget (D-98, new FR-INS-12, AC-71); the wallet check is removed to keep 0.1 small (D-99: FR-WAL-01 to 04, BR-30, BR-31, AC-62, AC-63 removed). FR-ACC-05: dates follow the phone’s time zone (D-101).</w:t>
             </w:r>
           </w:p>
         </w:tc>
@@ -5109,7 +5109,7 @@
                 <w:sz w:val="19"/>
                 <w:szCs w:val="19"/>
               </w:rPr>
-              <w:t xml:space="preserve">The app MUST let the student set time zone and first day of the week. Currency is fixed to MYR.</w:t>
+              <w:t>The app MUST let the student set the first day of the week. Dates follow the phone’s time zone; there is no separate time zone setting (D-101). Currency is fixed to MYR.</w:t>
             </w:r>
           </w:p>
         </w:tc>
@@ -22051,7 +22051,7 @@
                 <w:sz w:val="19"/>
                 <w:szCs w:val="19"/>
               </w:rPr>
-              <w:t>Account optional (D-05). Notification settings stay on the phone (D-94)</w:t>
+              <w:t>Account optional (D-05). time_zone is kept but not used; dates follow the phone (D-101). Notification settings stay on the phone (D-94)</w:t>
             </w:r>
           </w:p>
         </w:tc>
@@ -48877,6 +48877,115 @@
                 <w:szCs w:val="19"/>
               </w:rPr>
               <w:t>D-99</w:t>
+            </w:r>
+          </w:p>
+        </w:tc>
+      </w:tr>
+      <w:tr>
+        <w:trPr>
+          <w:cantSplit/>
+        </w:trPr>
+        <w:tc>
+          <w:tcPr>
+            <w:tcW w:type="dxa" w:w="2115"/>
+            <w:tcBorders>
+              <w:top w:val="single" w:color="C8D3CA" w:sz="4"/>
+              <w:left w:val="single" w:color="C8D3CA" w:sz="4"/>
+              <w:bottom w:val="single" w:color="C8D3CA" w:sz="4"/>
+              <w:right w:val="single" w:color="C8D3CA" w:sz="4"/>
+            </w:tcBorders>
+            <w:tcMar>
+              <w:top w:type="dxa" w:w="60"/>
+              <w:left w:type="dxa" w:w="100"/>
+              <w:bottom w:type="dxa" w:w="60"/>
+              <w:right w:type="dxa" w:w="100"/>
+            </w:tcMar>
+          </w:tcPr>
+          <w:p>
+            <w:r>
+              <w:rPr>
+                <w:sz w:val="19"/>
+                <w:szCs w:val="19"/>
+              </w:rPr>
+              <w:t>FR-ACC-05 (v1.7)</w:t>
+            </w:r>
+          </w:p>
+        </w:tc>
+        <w:tc>
+          <w:tcPr>
+            <w:tcW w:type="dxa" w:w="1175"/>
+            <w:tcBorders>
+              <w:top w:val="single" w:color="C8D3CA" w:sz="4"/>
+              <w:left w:val="single" w:color="C8D3CA" w:sz="4"/>
+              <w:bottom w:val="single" w:color="C8D3CA" w:sz="4"/>
+              <w:right w:val="single" w:color="C8D3CA" w:sz="4"/>
+            </w:tcBorders>
+            <w:tcMar>
+              <w:top w:type="dxa" w:w="60"/>
+              <w:left w:type="dxa" w:w="100"/>
+              <w:bottom w:type="dxa" w:w="60"/>
+              <w:right w:type="dxa" w:w="100"/>
+            </w:tcMar>
+          </w:tcPr>
+          <w:p>
+            <w:r>
+              <w:rPr>
+                <w:sz w:val="19"/>
+                <w:szCs w:val="19"/>
+              </w:rPr>
+              <w:t>Changed</w:t>
+            </w:r>
+          </w:p>
+        </w:tc>
+        <w:tc>
+          <w:tcPr>
+            <w:tcW w:type="dxa" w:w="4701"/>
+            <w:tcBorders>
+              <w:top w:val="single" w:color="C8D3CA" w:sz="4"/>
+              <w:left w:val="single" w:color="C8D3CA" w:sz="4"/>
+              <w:bottom w:val="single" w:color="C8D3CA" w:sz="4"/>
+              <w:right w:val="single" w:color="C8D3CA" w:sz="4"/>
+            </w:tcBorders>
+            <w:tcMar>
+              <w:top w:type="dxa" w:w="60"/>
+              <w:left w:type="dxa" w:w="100"/>
+              <w:bottom w:type="dxa" w:w="60"/>
+              <w:right w:type="dxa" w:w="100"/>
+            </w:tcMar>
+          </w:tcPr>
+          <w:p>
+            <w:r>
+              <w:rPr>
+                <w:sz w:val="19"/>
+                <w:szCs w:val="19"/>
+              </w:rPr>
+              <w:t>No time zone setting: dates follow the phone’s time zone; the student still sets the first day of the week.</w:t>
+            </w:r>
+          </w:p>
+        </w:tc>
+        <w:tc>
+          <w:tcPr>
+            <w:tcW w:type="dxa" w:w="1647"/>
+            <w:tcBorders>
+              <w:top w:val="single" w:color="C8D3CA" w:sz="4"/>
+              <w:left w:val="single" w:color="C8D3CA" w:sz="4"/>
+              <w:bottom w:val="single" w:color="C8D3CA" w:sz="4"/>
+              <w:right w:val="single" w:color="C8D3CA" w:sz="4"/>
+            </w:tcBorders>
+            <w:tcMar>
+              <w:top w:type="dxa" w:w="60"/>
+              <w:left w:type="dxa" w:w="100"/>
+              <w:bottom w:type="dxa" w:w="60"/>
+              <w:right w:type="dxa" w:w="100"/>
+            </w:tcMar>
+          </w:tcPr>
+          <w:p>
+            <w:r>
+              <w:rPr>
+                <w:sz w:val="19"/>
+                <w:szCs w:val="19"/>
+              </w:rPr>
+              <w:t>D-101</w:t>
             </w:r>
           </w:p>
         </w:tc>

</xml_diff>

<commit_message>
feat: hide a heads-up until it gets worse (D-102)
Co-Authored-By: Claude Opus 5.5 <noreply@anthropic.com>
</commit_message>
<xml_diff>
--- a/docs/requirements/Brokely_Software_Requirements_Specification_v1.7.docx
+++ b/docs/requirements/Brokely_Software_Requirements_Specification_v1.7.docx
@@ -12902,7 +12902,7 @@
                 <w:sz w:val="19"/>
                 <w:szCs w:val="19"/>
               </w:rPr>
-              <w:t>Insights MUST show a heads-up when an optional category has more spending this cycle than Meals (or, without Meals, the essential with the most spending), or more than its allocation (BR-34): the numbers, one suggested step and a way to see its records. Essentials and set-asides are never flagged (D-96).</w:t>
+              <w:t>Insights MUST show a heads-up when an optional category has more spending this cycle than Meals (or, without Meals, the essential with the most spending), or more than its allocation (BR-34): the numbers, one suggested step and a way to see its records. Essentials and set-asides are never flagged (D-96). The student MUST be able to hide a heads-up (with Undo); it stays hidden on that phone until the gap grows by another RM20, and a new cycle starts fresh (D-102).</w:t>
             </w:r>
           </w:p>
         </w:tc>
@@ -12954,7 +12954,7 @@
                 <w:sz w:val="19"/>
                 <w:szCs w:val="19"/>
               </w:rPr>
-              <w:t>AC-65</w:t>
+              <w:t>AC-65, AC-72</w:t>
             </w:r>
           </w:p>
         </w:tc>
@@ -31068,6 +31068,89 @@
           </w:p>
         </w:tc>
       </w:tr>
+      <w:tr>
+        <w:trPr>
+          <w:cantSplit/>
+        </w:trPr>
+        <w:tc>
+          <w:tcPr>
+            <w:tcW w:type="dxa" w:w="957"/>
+            <w:tcBorders>
+              <w:top w:val="single" w:color="C8D3CA" w:sz="4"/>
+              <w:left w:val="single" w:color="C8D3CA" w:sz="4"/>
+              <w:bottom w:val="single" w:color="C8D3CA" w:sz="4"/>
+              <w:right w:val="single" w:color="C8D3CA" w:sz="4"/>
+            </w:tcBorders>
+            <w:tcMar>
+              <w:top w:type="dxa" w:w="60"/>
+              <w:left w:type="dxa" w:w="100"/>
+              <w:bottom w:type="dxa" w:w="60"/>
+              <w:right w:type="dxa" w:w="100"/>
+            </w:tcMar>
+          </w:tcPr>
+          <w:p>
+            <w:r>
+              <w:rPr>
+                <w:sz w:val="19"/>
+                <w:szCs w:val="19"/>
+              </w:rPr>
+              <w:t>AC-72</w:t>
+            </w:r>
+          </w:p>
+        </w:tc>
+        <w:tc>
+          <w:tcPr>
+            <w:tcW w:type="dxa" w:w="4340"/>
+            <w:tcBorders>
+              <w:top w:val="single" w:color="C8D3CA" w:sz="4"/>
+              <w:left w:val="single" w:color="C8D3CA" w:sz="4"/>
+              <w:bottom w:val="single" w:color="C8D3CA" w:sz="4"/>
+              <w:right w:val="single" w:color="C8D3CA" w:sz="4"/>
+            </w:tcBorders>
+            <w:tcMar>
+              <w:top w:type="dxa" w:w="60"/>
+              <w:left w:type="dxa" w:w="100"/>
+              <w:bottom w:type="dxa" w:w="60"/>
+              <w:right w:type="dxa" w:w="100"/>
+            </w:tcMar>
+          </w:tcPr>
+          <w:p>
+            <w:r>
+              <w:rPr>
+                <w:sz w:val="19"/>
+                <w:szCs w:val="19"/>
+              </w:rPr>
+              <w:t>After AC-65, tap ✕ on the Fun &amp; trips heads-up; then tap Undo. Hide it again, then spend RM19.99 more on Fun &amp; trips, then RM0.01 more.</w:t>
+            </w:r>
+          </w:p>
+        </w:tc>
+        <w:tc>
+          <w:tcPr>
+            <w:tcW w:type="dxa" w:w="4341"/>
+            <w:tcBorders>
+              <w:top w:val="single" w:color="C8D3CA" w:sz="4"/>
+              <w:left w:val="single" w:color="C8D3CA" w:sz="4"/>
+              <w:bottom w:val="single" w:color="C8D3CA" w:sz="4"/>
+              <w:right w:val="single" w:color="C8D3CA" w:sz="4"/>
+            </w:tcBorders>
+            <w:tcMar>
+              <w:top w:type="dxa" w:w="60"/>
+              <w:left w:type="dxa" w:w="100"/>
+              <w:bottom w:type="dxa" w:w="60"/>
+              <w:right w:type="dxa" w:w="100"/>
+            </w:tcMar>
+          </w:tcPr>
+          <w:p>
+            <w:r>
+              <w:rPr>
+                <w:sz w:val="19"/>
+                <w:szCs w:val="19"/>
+              </w:rPr>
+              <w:t>The card goes and Undo brings it back. Hidden again, it stays away at RM19.99 more and comes back once the gap has grown by RM20.00.</w:t>
+            </w:r>
+          </w:p>
+        </w:tc>
+      </w:tr>
     </w:tbl>
     <w:p>
       <w:pPr>
@@ -39126,7 +39209,7 @@
                 <w:sz w:val="19"/>
                 <w:szCs w:val="19"/>
               </w:rPr>
-              <w:t>AC-65</w:t>
+              <w:t>AC-65, AC-72</w:t>
             </w:r>
           </w:p>
         </w:tc>
@@ -42925,7 +43008,7 @@
                 <w:sz w:val="19"/>
                 <w:szCs w:val="19"/>
               </w:rPr>
-              <w:t>Every 0.1 MUST requirement passes; AC-01 to AC-30, AC-39 to AC-41, AC-47 to AC-49, AC-52 to AC-61 and AC-64 to AC-71 pass; NFR-01 to NFR-12, NFR-14, NFR-15, NFR-18 and NFR-20 to NFR-22 verified.</w:t>
+              <w:t>Every 0.1 MUST requirement passes; AC-01 to AC-30, AC-39 to AC-41, AC-47 to AC-49, AC-52 to AC-61 and AC-64 to AC-72 pass; NFR-01 to NFR-12, NFR-14, NFR-15, NFR-18 and NFR-20 to NFR-22 verified.</w:t>
             </w:r>
           </w:p>
         </w:tc>
@@ -48986,6 +49069,115 @@
                 <w:szCs w:val="19"/>
               </w:rPr>
               <w:t>D-101</w:t>
+            </w:r>
+          </w:p>
+        </w:tc>
+      </w:tr>
+      <w:tr>
+        <w:trPr>
+          <w:cantSplit/>
+        </w:trPr>
+        <w:tc>
+          <w:tcPr>
+            <w:tcW w:type="dxa" w:w="2115"/>
+            <w:tcBorders>
+              <w:top w:val="single" w:color="C8D3CA" w:sz="4"/>
+              <w:left w:val="single" w:color="C8D3CA" w:sz="4"/>
+              <w:bottom w:val="single" w:color="C8D3CA" w:sz="4"/>
+              <w:right w:val="single" w:color="C8D3CA" w:sz="4"/>
+            </w:tcBorders>
+            <w:tcMar>
+              <w:top w:type="dxa" w:w="60"/>
+              <w:left w:type="dxa" w:w="100"/>
+              <w:bottom w:type="dxa" w:w="60"/>
+              <w:right w:type="dxa" w:w="100"/>
+            </w:tcMar>
+          </w:tcPr>
+          <w:p>
+            <w:r>
+              <w:rPr>
+                <w:sz w:val="19"/>
+                <w:szCs w:val="19"/>
+              </w:rPr>
+              <w:t>FR-INS-11, AC-72 (v1.7)</w:t>
+            </w:r>
+          </w:p>
+        </w:tc>
+        <w:tc>
+          <w:tcPr>
+            <w:tcW w:type="dxa" w:w="1175"/>
+            <w:tcBorders>
+              <w:top w:val="single" w:color="C8D3CA" w:sz="4"/>
+              <w:left w:val="single" w:color="C8D3CA" w:sz="4"/>
+              <w:bottom w:val="single" w:color="C8D3CA" w:sz="4"/>
+              <w:right w:val="single" w:color="C8D3CA" w:sz="4"/>
+            </w:tcBorders>
+            <w:tcMar>
+              <w:top w:type="dxa" w:w="60"/>
+              <w:left w:type="dxa" w:w="100"/>
+              <w:bottom w:type="dxa" w:w="60"/>
+              <w:right w:type="dxa" w:w="100"/>
+            </w:tcMar>
+          </w:tcPr>
+          <w:p>
+            <w:r>
+              <w:rPr>
+                <w:sz w:val="19"/>
+                <w:szCs w:val="19"/>
+              </w:rPr>
+              <w:t>Changed / new</w:t>
+            </w:r>
+          </w:p>
+        </w:tc>
+        <w:tc>
+          <w:tcPr>
+            <w:tcW w:type="dxa" w:w="4701"/>
+            <w:tcBorders>
+              <w:top w:val="single" w:color="C8D3CA" w:sz="4"/>
+              <w:left w:val="single" w:color="C8D3CA" w:sz="4"/>
+              <w:bottom w:val="single" w:color="C8D3CA" w:sz="4"/>
+              <w:right w:val="single" w:color="C8D3CA" w:sz="4"/>
+            </w:tcBorders>
+            <w:tcMar>
+              <w:top w:type="dxa" w:w="60"/>
+              <w:left w:type="dxa" w:w="100"/>
+              <w:bottom w:type="dxa" w:w="60"/>
+              <w:right w:type="dxa" w:w="100"/>
+            </w:tcMar>
+          </w:tcPr>
+          <w:p>
+            <w:r>
+              <w:rPr>
+                <w:sz w:val="19"/>
+                <w:szCs w:val="19"/>
+              </w:rPr>
+              <w:t>A heads-up can be hidden; it returns only if the gap grows by another RM20.</w:t>
+            </w:r>
+          </w:p>
+        </w:tc>
+        <w:tc>
+          <w:tcPr>
+            <w:tcW w:type="dxa" w:w="1647"/>
+            <w:tcBorders>
+              <w:top w:val="single" w:color="C8D3CA" w:sz="4"/>
+              <w:left w:val="single" w:color="C8D3CA" w:sz="4"/>
+              <w:bottom w:val="single" w:color="C8D3CA" w:sz="4"/>
+              <w:right w:val="single" w:color="C8D3CA" w:sz="4"/>
+            </w:tcBorders>
+            <w:tcMar>
+              <w:top w:type="dxa" w:w="60"/>
+              <w:left w:type="dxa" w:w="100"/>
+              <w:bottom w:type="dxa" w:w="60"/>
+              <w:right w:type="dxa" w:w="100"/>
+            </w:tcMar>
+          </w:tcPr>
+          <w:p>
+            <w:r>
+              <w:rPr>
+                <w:sz w:val="19"/>
+                <w:szCs w:val="19"/>
+              </w:rPr>
+              <w:t>D-102</w:t>
             </w:r>
           </w:p>
         </w:tc>

</xml_diff>

<commit_message>
feat: pay-back date when lending or borrowing, editable on the debt (D-103)
Co-Authored-By: Claude Opus 5.5 <noreply@anthropic.com>
</commit_message>
<xml_diff>
--- a/docs/requirements/Brokely_Software_Requirements_Specification_v1.7.docx
+++ b/docs/requirements/Brokely_Software_Requirements_Specification_v1.7.docx
@@ -11603,6 +11603,115 @@
           </w:p>
         </w:tc>
       </w:tr>
+      <w:tr>
+        <w:trPr>
+          <w:cantSplit/>
+        </w:trPr>
+        <w:tc>
+          <w:tcPr>
+            <w:tcW w:type="dxa" w:w="1451"/>
+            <w:tcBorders>
+              <w:top w:val="single" w:color="C8D3CA" w:sz="4"/>
+              <w:left w:val="single" w:color="C8D3CA" w:sz="4"/>
+              <w:bottom w:val="single" w:color="C8D3CA" w:sz="4"/>
+              <w:right w:val="single" w:color="C8D3CA" w:sz="4"/>
+            </w:tcBorders>
+            <w:tcMar>
+              <w:top w:type="dxa" w:w="60"/>
+              <w:left w:type="dxa" w:w="100"/>
+              <w:bottom w:type="dxa" w:w="60"/>
+              <w:right w:type="dxa" w:w="100"/>
+            </w:tcMar>
+          </w:tcPr>
+          <w:p>
+            <w:r>
+              <w:rPr>
+                <w:sz w:val="19"/>
+                <w:szCs w:val="19"/>
+              </w:rPr>
+              <w:t>FR-DEBT-07</w:t>
+            </w:r>
+          </w:p>
+        </w:tc>
+        <w:tc>
+          <w:tcPr>
+            <w:tcW w:type="dxa" w:w="6038"/>
+            <w:tcBorders>
+              <w:top w:val="single" w:color="C8D3CA" w:sz="4"/>
+              <w:left w:val="single" w:color="C8D3CA" w:sz="4"/>
+              <w:bottom w:val="single" w:color="C8D3CA" w:sz="4"/>
+              <w:right w:val="single" w:color="C8D3CA" w:sz="4"/>
+            </w:tcBorders>
+            <w:tcMar>
+              <w:top w:type="dxa" w:w="60"/>
+              <w:left w:type="dxa" w:w="100"/>
+              <w:bottom w:type="dxa" w:w="60"/>
+              <w:right w:type="dxa" w:w="100"/>
+            </w:tcMar>
+          </w:tcPr>
+          <w:p>
+            <w:r>
+              <w:rPr>
+                <w:sz w:val="19"/>
+                <w:szCs w:val="19"/>
+              </w:rPr>
+              <w:t>When lending or borrowing, and later on the debt's page, the student MAY set a “pay back by” date (No date, In a week, End of month or any date), change it or remove it; the debt-due reminder uses it (D-103).</w:t>
+            </w:r>
+          </w:p>
+        </w:tc>
+        <w:tc>
+          <w:tcPr>
+            <w:tcW w:type="dxa" w:w="696"/>
+            <w:tcBorders>
+              <w:top w:val="single" w:color="C8D3CA" w:sz="4"/>
+              <w:left w:val="single" w:color="C8D3CA" w:sz="4"/>
+              <w:bottom w:val="single" w:color="C8D3CA" w:sz="4"/>
+              <w:right w:val="single" w:color="C8D3CA" w:sz="4"/>
+            </w:tcBorders>
+            <w:tcMar>
+              <w:top w:type="dxa" w:w="60"/>
+              <w:left w:type="dxa" w:w="100"/>
+              <w:bottom w:type="dxa" w:w="60"/>
+              <w:right w:type="dxa" w:w="100"/>
+            </w:tcMar>
+          </w:tcPr>
+          <w:p>
+            <w:r>
+              <w:rPr>
+                <w:sz w:val="19"/>
+                <w:szCs w:val="19"/>
+              </w:rPr>
+              <w:t>0.1</w:t>
+            </w:r>
+          </w:p>
+        </w:tc>
+        <w:tc>
+          <w:tcPr>
+            <w:tcW w:type="dxa" w:w="1453"/>
+            <w:tcBorders>
+              <w:top w:val="single" w:color="C8D3CA" w:sz="4"/>
+              <w:left w:val="single" w:color="C8D3CA" w:sz="4"/>
+              <w:bottom w:val="single" w:color="C8D3CA" w:sz="4"/>
+              <w:right w:val="single" w:color="C8D3CA" w:sz="4"/>
+            </w:tcBorders>
+            <w:tcMar>
+              <w:top w:type="dxa" w:w="60"/>
+              <w:left w:type="dxa" w:w="100"/>
+              <w:bottom w:type="dxa" w:w="60"/>
+              <w:right w:type="dxa" w:w="100"/>
+            </w:tcMar>
+          </w:tcPr>
+          <w:p>
+            <w:r>
+              <w:rPr>
+                <w:sz w:val="19"/>
+                <w:szCs w:val="19"/>
+              </w:rPr>
+              <w:t>AC-73</w:t>
+            </w:r>
+          </w:p>
+        </w:tc>
+      </w:tr>
     </w:tbl>
     <w:p>
       <w:pPr>
@@ -31151,6 +31260,89 @@
           </w:p>
         </w:tc>
       </w:tr>
+      <w:tr>
+        <w:trPr>
+          <w:cantSplit/>
+        </w:trPr>
+        <w:tc>
+          <w:tcPr>
+            <w:tcW w:type="dxa" w:w="957"/>
+            <w:tcBorders>
+              <w:top w:val="single" w:color="C8D3CA" w:sz="4"/>
+              <w:left w:val="single" w:color="C8D3CA" w:sz="4"/>
+              <w:bottom w:val="single" w:color="C8D3CA" w:sz="4"/>
+              <w:right w:val="single" w:color="C8D3CA" w:sz="4"/>
+            </w:tcBorders>
+            <w:tcMar>
+              <w:top w:type="dxa" w:w="60"/>
+              <w:left w:type="dxa" w:w="100"/>
+              <w:bottom w:type="dxa" w:w="60"/>
+              <w:right w:type="dxa" w:w="100"/>
+            </w:tcMar>
+          </w:tcPr>
+          <w:p>
+            <w:r>
+              <w:rPr>
+                <w:sz w:val="19"/>
+                <w:szCs w:val="19"/>
+              </w:rPr>
+              <w:t>AC-73</w:t>
+            </w:r>
+          </w:p>
+        </w:tc>
+        <w:tc>
+          <w:tcPr>
+            <w:tcW w:type="dxa" w:w="4340"/>
+            <w:tcBorders>
+              <w:top w:val="single" w:color="C8D3CA" w:sz="4"/>
+              <w:left w:val="single" w:color="C8D3CA" w:sz="4"/>
+              <w:bottom w:val="single" w:color="C8D3CA" w:sz="4"/>
+              <w:right w:val="single" w:color="C8D3CA" w:sz="4"/>
+            </w:tcBorders>
+            <w:tcMar>
+              <w:top w:type="dxa" w:w="60"/>
+              <w:left w:type="dxa" w:w="100"/>
+              <w:bottom w:type="dxa" w:w="60"/>
+              <w:right w:type="dxa" w:w="100"/>
+            </w:tcMar>
+          </w:tcPr>
+          <w:p>
+            <w:r>
+              <w:rPr>
+                <w:sz w:val="19"/>
+                <w:szCs w:val="19"/>
+              </w:rPr>
+              <w:t>On 23 Oct 2026, Add → More → I lent money: Aiman, RM50, tap “End of month”. Later open the debt and tap “No date”.</w:t>
+            </w:r>
+          </w:p>
+        </w:tc>
+        <w:tc>
+          <w:tcPr>
+            <w:tcW w:type="dxa" w:w="4341"/>
+            <w:tcBorders>
+              <w:top w:val="single" w:color="C8D3CA" w:sz="4"/>
+              <w:left w:val="single" w:color="C8D3CA" w:sz="4"/>
+              <w:bottom w:val="single" w:color="C8D3CA" w:sz="4"/>
+              <w:right w:val="single" w:color="C8D3CA" w:sz="4"/>
+            </w:tcBorders>
+            <w:tcMar>
+              <w:top w:type="dxa" w:w="60"/>
+              <w:left w:type="dxa" w:w="100"/>
+              <w:bottom w:type="dxa" w:w="60"/>
+              <w:right w:type="dxa" w:w="100"/>
+            </w:tcMar>
+          </w:tcPr>
+          <w:p>
+            <w:r>
+              <w:rPr>
+                <w:sz w:val="19"/>
+                <w:szCs w:val="19"/>
+              </w:rPr>
+              <w:t>The debt shows “Due 31 Oct” and a 9:00 reminder is planned for that day; after “No date” the due date and its reminder are gone. Both changes sync.</w:t>
+            </w:r>
+          </w:p>
+        </w:tc>
+      </w:tr>
     </w:tbl>
     <w:p>
       <w:pPr>
@@ -38327,6 +38519,89 @@
                 <w:sz w:val="19"/>
                 <w:szCs w:val="19"/>
               </w:rPr>
+              <w:t>FR-DEBT-07</w:t>
+            </w:r>
+          </w:p>
+        </w:tc>
+        <w:tc>
+          <w:tcPr>
+            <w:tcW w:type="dxa" w:w="1482"/>
+            <w:tcBorders>
+              <w:top w:val="single" w:color="C8D3CA" w:sz="4"/>
+              <w:left w:val="single" w:color="C8D3CA" w:sz="4"/>
+              <w:bottom w:val="single" w:color="C8D3CA" w:sz="4"/>
+              <w:right w:val="single" w:color="C8D3CA" w:sz="4"/>
+            </w:tcBorders>
+            <w:tcMar>
+              <w:top w:type="dxa" w:w="60"/>
+              <w:left w:type="dxa" w:w="100"/>
+              <w:bottom w:type="dxa" w:w="60"/>
+              <w:right w:type="dxa" w:w="100"/>
+            </w:tcMar>
+          </w:tcPr>
+          <w:p>
+            <w:r>
+              <w:rPr>
+                <w:sz w:val="19"/>
+                <w:szCs w:val="19"/>
+              </w:rPr>
+              <w:t>0.1</w:t>
+            </w:r>
+          </w:p>
+        </w:tc>
+        <w:tc>
+          <w:tcPr>
+            <w:tcW w:type="dxa" w:w="5932"/>
+            <w:tcBorders>
+              <w:top w:val="single" w:color="C8D3CA" w:sz="4"/>
+              <w:left w:val="single" w:color="C8D3CA" w:sz="4"/>
+              <w:bottom w:val="single" w:color="C8D3CA" w:sz="4"/>
+              <w:right w:val="single" w:color="C8D3CA" w:sz="4"/>
+            </w:tcBorders>
+            <w:tcMar>
+              <w:top w:type="dxa" w:w="60"/>
+              <w:left w:type="dxa" w:w="100"/>
+              <w:bottom w:type="dxa" w:w="60"/>
+              <w:right w:type="dxa" w:w="100"/>
+            </w:tcMar>
+          </w:tcPr>
+          <w:p>
+            <w:r>
+              <w:rPr>
+                <w:sz w:val="19"/>
+                <w:szCs w:val="19"/>
+              </w:rPr>
+              <w:t>AC-73</w:t>
+            </w:r>
+          </w:p>
+        </w:tc>
+      </w:tr>
+      <w:tr>
+        <w:trPr>
+          <w:cantSplit/>
+        </w:trPr>
+        <w:tc>
+          <w:tcPr>
+            <w:tcW w:type="dxa" w:w="2224"/>
+            <w:tcBorders>
+              <w:top w:val="single" w:color="C8D3CA" w:sz="4"/>
+              <w:left w:val="single" w:color="C8D3CA" w:sz="4"/>
+              <w:bottom w:val="single" w:color="C8D3CA" w:sz="4"/>
+              <w:right w:val="single" w:color="C8D3CA" w:sz="4"/>
+            </w:tcBorders>
+            <w:tcMar>
+              <w:top w:type="dxa" w:w="60"/>
+              <w:left w:type="dxa" w:w="100"/>
+              <w:bottom w:type="dxa" w:w="60"/>
+              <w:right w:type="dxa" w:w="100"/>
+            </w:tcMar>
+          </w:tcPr>
+          <w:p>
+            <w:r>
+              <w:rPr>
+                <w:sz w:val="19"/>
+                <w:szCs w:val="19"/>
+              </w:rPr>
               <w:t xml:space="preserve">FR-INS-01</w:t>
             </w:r>
           </w:p>
@@ -43008,7 +43283,7 @@
                 <w:sz w:val="19"/>
                 <w:szCs w:val="19"/>
               </w:rPr>
-              <w:t>Every 0.1 MUST requirement passes; AC-01 to AC-30, AC-39 to AC-41, AC-47 to AC-49, AC-52 to AC-61 and AC-64 to AC-72 pass; NFR-01 to NFR-12, NFR-14, NFR-15, NFR-18 and NFR-20 to NFR-22 verified.</w:t>
+              <w:t>Every 0.1 MUST requirement passes; AC-01 to AC-30, AC-39 to AC-41, AC-47 to AC-49, AC-52 to AC-61 and AC-64 to AC-73 pass; NFR-01 to NFR-12, NFR-14, NFR-15, NFR-18 and NFR-20 to NFR-22 verified.</w:t>
             </w:r>
           </w:p>
         </w:tc>
@@ -49178,6 +49453,115 @@
                 <w:szCs w:val="19"/>
               </w:rPr>
               <w:t>D-102</w:t>
+            </w:r>
+          </w:p>
+        </w:tc>
+      </w:tr>
+      <w:tr>
+        <w:trPr>
+          <w:cantSplit/>
+        </w:trPr>
+        <w:tc>
+          <w:tcPr>
+            <w:tcW w:type="dxa" w:w="2115"/>
+            <w:tcBorders>
+              <w:top w:val="single" w:color="C8D3CA" w:sz="4"/>
+              <w:left w:val="single" w:color="C8D3CA" w:sz="4"/>
+              <w:bottom w:val="single" w:color="C8D3CA" w:sz="4"/>
+              <w:right w:val="single" w:color="C8D3CA" w:sz="4"/>
+            </w:tcBorders>
+            <w:tcMar>
+              <w:top w:type="dxa" w:w="60"/>
+              <w:left w:type="dxa" w:w="100"/>
+              <w:bottom w:type="dxa" w:w="60"/>
+              <w:right w:type="dxa" w:w="100"/>
+            </w:tcMar>
+          </w:tcPr>
+          <w:p>
+            <w:r>
+              <w:rPr>
+                <w:sz w:val="19"/>
+                <w:szCs w:val="19"/>
+              </w:rPr>
+              <w:t>FR-DEBT-07, AC-73 (v1.7)</w:t>
+            </w:r>
+          </w:p>
+        </w:tc>
+        <w:tc>
+          <w:tcPr>
+            <w:tcW w:type="dxa" w:w="1175"/>
+            <w:tcBorders>
+              <w:top w:val="single" w:color="C8D3CA" w:sz="4"/>
+              <w:left w:val="single" w:color="C8D3CA" w:sz="4"/>
+              <w:bottom w:val="single" w:color="C8D3CA" w:sz="4"/>
+              <w:right w:val="single" w:color="C8D3CA" w:sz="4"/>
+            </w:tcBorders>
+            <w:tcMar>
+              <w:top w:type="dxa" w:w="60"/>
+              <w:left w:type="dxa" w:w="100"/>
+              <w:bottom w:type="dxa" w:w="60"/>
+              <w:right w:type="dxa" w:w="100"/>
+            </w:tcMar>
+          </w:tcPr>
+          <w:p>
+            <w:r>
+              <w:rPr>
+                <w:sz w:val="19"/>
+                <w:szCs w:val="19"/>
+              </w:rPr>
+              <w:t>New</w:t>
+            </w:r>
+          </w:p>
+        </w:tc>
+        <w:tc>
+          <w:tcPr>
+            <w:tcW w:type="dxa" w:w="4701"/>
+            <w:tcBorders>
+              <w:top w:val="single" w:color="C8D3CA" w:sz="4"/>
+              <w:left w:val="single" w:color="C8D3CA" w:sz="4"/>
+              <w:bottom w:val="single" w:color="C8D3CA" w:sz="4"/>
+              <w:right w:val="single" w:color="C8D3CA" w:sz="4"/>
+            </w:tcBorders>
+            <w:tcMar>
+              <w:top w:type="dxa" w:w="60"/>
+              <w:left w:type="dxa" w:w="100"/>
+              <w:bottom w:type="dxa" w:w="60"/>
+              <w:right w:type="dxa" w:w="100"/>
+            </w:tcMar>
+          </w:tcPr>
+          <w:p>
+            <w:r>
+              <w:rPr>
+                <w:sz w:val="19"/>
+                <w:szCs w:val="19"/>
+              </w:rPr>
+              <w:t>Pay-back date when lending or borrowing, editable on the debt.</w:t>
+            </w:r>
+          </w:p>
+        </w:tc>
+        <w:tc>
+          <w:tcPr>
+            <w:tcW w:type="dxa" w:w="1647"/>
+            <w:tcBorders>
+              <w:top w:val="single" w:color="C8D3CA" w:sz="4"/>
+              <w:left w:val="single" w:color="C8D3CA" w:sz="4"/>
+              <w:bottom w:val="single" w:color="C8D3CA" w:sz="4"/>
+              <w:right w:val="single" w:color="C8D3CA" w:sz="4"/>
+            </w:tcBorders>
+            <w:tcMar>
+              <w:top w:type="dxa" w:w="60"/>
+              <w:left w:type="dxa" w:w="100"/>
+              <w:bottom w:type="dxa" w:w="60"/>
+              <w:right w:type="dxa" w:w="100"/>
+            </w:tcMar>
+          </w:tcPr>
+          <w:p>
+            <w:r>
+              <w:rPr>
+                <w:sz w:val="19"/>
+                <w:szCs w:val="19"/>
+              </w:rPr>
+              <w:t>D-103</w:t>
             </w:r>
           </w:p>
         </w:tc>

</xml_diff>

<commit_message>
feat(mobile): paying someone back from quick add, never as spending (D-104)
Co-Authored-By: Claude Opus 5.5 <noreply@anthropic.com>
</commit_message>
<xml_diff>
--- a/docs/requirements/Brokely_Software_Requirements_Specification_v1.7.docx
+++ b/docs/requirements/Brokely_Software_Requirements_Specification_v1.7.docx
@@ -11712,6 +11712,115 @@
           </w:p>
         </w:tc>
       </w:tr>
+      <w:tr>
+        <w:trPr>
+          <w:cantSplit/>
+        </w:trPr>
+        <w:tc>
+          <w:tcPr>
+            <w:tcW w:type="dxa" w:w="1451"/>
+            <w:tcBorders>
+              <w:top w:val="single" w:color="C8D3CA" w:sz="4"/>
+              <w:left w:val="single" w:color="C8D3CA" w:sz="4"/>
+              <w:bottom w:val="single" w:color="C8D3CA" w:sz="4"/>
+              <w:right w:val="single" w:color="C8D3CA" w:sz="4"/>
+            </w:tcBorders>
+            <w:tcMar>
+              <w:top w:type="dxa" w:w="60"/>
+              <w:left w:type="dxa" w:w="100"/>
+              <w:bottom w:type="dxa" w:w="60"/>
+              <w:right w:type="dxa" w:w="100"/>
+            </w:tcMar>
+          </w:tcPr>
+          <w:p>
+            <w:r>
+              <w:rPr>
+                <w:sz w:val="19"/>
+                <w:szCs w:val="19"/>
+              </w:rPr>
+              <w:t>FR-DEBT-08</w:t>
+            </w:r>
+          </w:p>
+        </w:tc>
+        <w:tc>
+          <w:tcPr>
+            <w:tcW w:type="dxa" w:w="6038"/>
+            <w:tcBorders>
+              <w:top w:val="single" w:color="C8D3CA" w:sz="4"/>
+              <w:left w:val="single" w:color="C8D3CA" w:sz="4"/>
+              <w:bottom w:val="single" w:color="C8D3CA" w:sz="4"/>
+              <w:right w:val="single" w:color="C8D3CA" w:sz="4"/>
+            </w:tcBorders>
+            <w:tcMar>
+              <w:top w:type="dxa" w:w="60"/>
+              <w:left w:type="dxa" w:w="100"/>
+              <w:bottom w:type="dxa" w:w="60"/>
+              <w:right w:type="dxa" w:w="100"/>
+            </w:tcMar>
+          </w:tcPr>
+          <w:p>
+            <w:r>
+              <w:rPr>
+                <w:sz w:val="19"/>
+                <w:szCs w:val="19"/>
+              </w:rPr>
+              <w:t>The category list in quick add (Spent) MUST end with “Paying someone back?”: the student’s open debts and a link to Debts. Choosing a debt opens its repayment with the typed amount, recorded as a repayment, never as spending (FR-DEBT-06, D-104).</w:t>
+            </w:r>
+          </w:p>
+        </w:tc>
+        <w:tc>
+          <w:tcPr>
+            <w:tcW w:type="dxa" w:w="696"/>
+            <w:tcBorders>
+              <w:top w:val="single" w:color="C8D3CA" w:sz="4"/>
+              <w:left w:val="single" w:color="C8D3CA" w:sz="4"/>
+              <w:bottom w:val="single" w:color="C8D3CA" w:sz="4"/>
+              <w:right w:val="single" w:color="C8D3CA" w:sz="4"/>
+            </w:tcBorders>
+            <w:tcMar>
+              <w:top w:type="dxa" w:w="60"/>
+              <w:left w:type="dxa" w:w="100"/>
+              <w:bottom w:type="dxa" w:w="60"/>
+              <w:right w:type="dxa" w:w="100"/>
+            </w:tcMar>
+          </w:tcPr>
+          <w:p>
+            <w:r>
+              <w:rPr>
+                <w:sz w:val="19"/>
+                <w:szCs w:val="19"/>
+              </w:rPr>
+              <w:t>0.1</w:t>
+            </w:r>
+          </w:p>
+        </w:tc>
+        <w:tc>
+          <w:tcPr>
+            <w:tcW w:type="dxa" w:w="1453"/>
+            <w:tcBorders>
+              <w:top w:val="single" w:color="C8D3CA" w:sz="4"/>
+              <w:left w:val="single" w:color="C8D3CA" w:sz="4"/>
+              <w:bottom w:val="single" w:color="C8D3CA" w:sz="4"/>
+              <w:right w:val="single" w:color="C8D3CA" w:sz="4"/>
+            </w:tcBorders>
+            <w:tcMar>
+              <w:top w:type="dxa" w:w="60"/>
+              <w:left w:type="dxa" w:w="100"/>
+              <w:bottom w:type="dxa" w:w="60"/>
+              <w:right w:type="dxa" w:w="100"/>
+            </w:tcMar>
+          </w:tcPr>
+          <w:p>
+            <w:r>
+              <w:rPr>
+                <w:sz w:val="19"/>
+                <w:szCs w:val="19"/>
+              </w:rPr>
+              <w:t>AC-74</w:t>
+            </w:r>
+          </w:p>
+        </w:tc>
+      </w:tr>
     </w:tbl>
     <w:p>
       <w:pPr>
@@ -31343,6 +31452,89 @@
           </w:p>
         </w:tc>
       </w:tr>
+      <w:tr>
+        <w:trPr>
+          <w:cantSplit/>
+        </w:trPr>
+        <w:tc>
+          <w:tcPr>
+            <w:tcW w:type="dxa" w:w="957"/>
+            <w:tcBorders>
+              <w:top w:val="single" w:color="C8D3CA" w:sz="4"/>
+              <w:left w:val="single" w:color="C8D3CA" w:sz="4"/>
+              <w:bottom w:val="single" w:color="C8D3CA" w:sz="4"/>
+              <w:right w:val="single" w:color="C8D3CA" w:sz="4"/>
+            </w:tcBorders>
+            <w:tcMar>
+              <w:top w:type="dxa" w:w="60"/>
+              <w:left w:type="dxa" w:w="100"/>
+              <w:bottom w:type="dxa" w:w="60"/>
+              <w:right w:type="dxa" w:w="100"/>
+            </w:tcMar>
+          </w:tcPr>
+          <w:p>
+            <w:r>
+              <w:rPr>
+                <w:sz w:val="19"/>
+                <w:szCs w:val="19"/>
+              </w:rPr>
+              <w:t>AC-74</w:t>
+            </w:r>
+          </w:p>
+        </w:tc>
+        <w:tc>
+          <w:tcPr>
+            <w:tcW w:type="dxa" w:w="4340"/>
+            <w:tcBorders>
+              <w:top w:val="single" w:color="C8D3CA" w:sz="4"/>
+              <w:left w:val="single" w:color="C8D3CA" w:sz="4"/>
+              <w:bottom w:val="single" w:color="C8D3CA" w:sz="4"/>
+              <w:right w:val="single" w:color="C8D3CA" w:sz="4"/>
+            </w:tcBorders>
+            <w:tcMar>
+              <w:top w:type="dxa" w:w="60"/>
+              <w:left w:type="dxa" w:w="100"/>
+              <w:bottom w:type="dxa" w:w="60"/>
+              <w:right w:type="dxa" w:w="100"/>
+            </w:tcMar>
+          </w:tcPr>
+          <w:p>
+            <w:r>
+              <w:rPr>
+                <w:sz w:val="19"/>
+                <w:szCs w:val="19"/>
+              </w:rPr>
+              <w:t>Owe Aiman RM30. Add → Spent, type 10, open Category, tap Aiman under “Paying someone back?”, save.</w:t>
+            </w:r>
+          </w:p>
+        </w:tc>
+        <w:tc>
+          <w:tcPr>
+            <w:tcW w:type="dxa" w:w="4341"/>
+            <w:tcBorders>
+              <w:top w:val="single" w:color="C8D3CA" w:sz="4"/>
+              <w:left w:val="single" w:color="C8D3CA" w:sz="4"/>
+              <w:bottom w:val="single" w:color="C8D3CA" w:sz="4"/>
+              <w:right w:val="single" w:color="C8D3CA" w:sz="4"/>
+            </w:tcBorders>
+            <w:tcMar>
+              <w:top w:type="dxa" w:w="60"/>
+              <w:left w:type="dxa" w:w="100"/>
+              <w:bottom w:type="dxa" w:w="60"/>
+              <w:right w:type="dxa" w:w="100"/>
+            </w:tcMar>
+          </w:tcPr>
+          <w:p>
+            <w:r>
+              <w:rPr>
+                <w:sz w:val="19"/>
+                <w:szCs w:val="19"/>
+              </w:rPr>
+              <w:t>The repayment sheet opens with RM10.00; after saving, Aiman’s debt is RM20 and spending and left in plan are unchanged.</w:t>
+            </w:r>
+          </w:p>
+        </w:tc>
+      </w:tr>
     </w:tbl>
     <w:p>
       <w:pPr>
@@ -38602,6 +38794,89 @@
                 <w:sz w:val="19"/>
                 <w:szCs w:val="19"/>
               </w:rPr>
+              <w:t>FR-DEBT-08</w:t>
+            </w:r>
+          </w:p>
+        </w:tc>
+        <w:tc>
+          <w:tcPr>
+            <w:tcW w:type="dxa" w:w="1482"/>
+            <w:tcBorders>
+              <w:top w:val="single" w:color="C8D3CA" w:sz="4"/>
+              <w:left w:val="single" w:color="C8D3CA" w:sz="4"/>
+              <w:bottom w:val="single" w:color="C8D3CA" w:sz="4"/>
+              <w:right w:val="single" w:color="C8D3CA" w:sz="4"/>
+            </w:tcBorders>
+            <w:tcMar>
+              <w:top w:type="dxa" w:w="60"/>
+              <w:left w:type="dxa" w:w="100"/>
+              <w:bottom w:type="dxa" w:w="60"/>
+              <w:right w:type="dxa" w:w="100"/>
+            </w:tcMar>
+          </w:tcPr>
+          <w:p>
+            <w:r>
+              <w:rPr>
+                <w:sz w:val="19"/>
+                <w:szCs w:val="19"/>
+              </w:rPr>
+              <w:t>0.1</w:t>
+            </w:r>
+          </w:p>
+        </w:tc>
+        <w:tc>
+          <w:tcPr>
+            <w:tcW w:type="dxa" w:w="5932"/>
+            <w:tcBorders>
+              <w:top w:val="single" w:color="C8D3CA" w:sz="4"/>
+              <w:left w:val="single" w:color="C8D3CA" w:sz="4"/>
+              <w:bottom w:val="single" w:color="C8D3CA" w:sz="4"/>
+              <w:right w:val="single" w:color="C8D3CA" w:sz="4"/>
+            </w:tcBorders>
+            <w:tcMar>
+              <w:top w:type="dxa" w:w="60"/>
+              <w:left w:type="dxa" w:w="100"/>
+              <w:bottom w:type="dxa" w:w="60"/>
+              <w:right w:type="dxa" w:w="100"/>
+            </w:tcMar>
+          </w:tcPr>
+          <w:p>
+            <w:r>
+              <w:rPr>
+                <w:sz w:val="19"/>
+                <w:szCs w:val="19"/>
+              </w:rPr>
+              <w:t>AC-74</w:t>
+            </w:r>
+          </w:p>
+        </w:tc>
+      </w:tr>
+      <w:tr>
+        <w:trPr>
+          <w:cantSplit/>
+        </w:trPr>
+        <w:tc>
+          <w:tcPr>
+            <w:tcW w:type="dxa" w:w="2224"/>
+            <w:tcBorders>
+              <w:top w:val="single" w:color="C8D3CA" w:sz="4"/>
+              <w:left w:val="single" w:color="C8D3CA" w:sz="4"/>
+              <w:bottom w:val="single" w:color="C8D3CA" w:sz="4"/>
+              <w:right w:val="single" w:color="C8D3CA" w:sz="4"/>
+            </w:tcBorders>
+            <w:tcMar>
+              <w:top w:type="dxa" w:w="60"/>
+              <w:left w:type="dxa" w:w="100"/>
+              <w:bottom w:type="dxa" w:w="60"/>
+              <w:right w:type="dxa" w:w="100"/>
+            </w:tcMar>
+          </w:tcPr>
+          <w:p>
+            <w:r>
+              <w:rPr>
+                <w:sz w:val="19"/>
+                <w:szCs w:val="19"/>
+              </w:rPr>
               <w:t xml:space="preserve">FR-INS-01</w:t>
             </w:r>
           </w:p>
@@ -43283,7 +43558,7 @@
                 <w:sz w:val="19"/>
                 <w:szCs w:val="19"/>
               </w:rPr>
-              <w:t>Every 0.1 MUST requirement passes; AC-01 to AC-30, AC-39 to AC-41, AC-47 to AC-49, AC-52 to AC-61 and AC-64 to AC-73 pass; NFR-01 to NFR-12, NFR-14, NFR-15, NFR-18 and NFR-20 to NFR-22 verified.</w:t>
+              <w:t>Every 0.1 MUST requirement passes; AC-01 to AC-30, AC-39 to AC-41, AC-47 to AC-49, AC-52 to AC-61 and AC-64 to AC-74 pass; NFR-01 to NFR-12, NFR-14, NFR-15, NFR-18 and NFR-20 to NFR-22 verified.</w:t>
             </w:r>
           </w:p>
         </w:tc>
@@ -49562,6 +49837,115 @@
                 <w:szCs w:val="19"/>
               </w:rPr>
               <w:t>D-103</w:t>
+            </w:r>
+          </w:p>
+        </w:tc>
+      </w:tr>
+      <w:tr>
+        <w:trPr>
+          <w:cantSplit/>
+        </w:trPr>
+        <w:tc>
+          <w:tcPr>
+            <w:tcW w:type="dxa" w:w="2115"/>
+            <w:tcBorders>
+              <w:top w:val="single" w:color="C8D3CA" w:sz="4"/>
+              <w:left w:val="single" w:color="C8D3CA" w:sz="4"/>
+              <w:bottom w:val="single" w:color="C8D3CA" w:sz="4"/>
+              <w:right w:val="single" w:color="C8D3CA" w:sz="4"/>
+            </w:tcBorders>
+            <w:tcMar>
+              <w:top w:type="dxa" w:w="60"/>
+              <w:left w:type="dxa" w:w="100"/>
+              <w:bottom w:type="dxa" w:w="60"/>
+              <w:right w:type="dxa" w:w="100"/>
+            </w:tcMar>
+          </w:tcPr>
+          <w:p>
+            <w:r>
+              <w:rPr>
+                <w:sz w:val="19"/>
+                <w:szCs w:val="19"/>
+              </w:rPr>
+              <w:t>FR-DEBT-08, AC-74 (v1.7)</w:t>
+            </w:r>
+          </w:p>
+        </w:tc>
+        <w:tc>
+          <w:tcPr>
+            <w:tcW w:type="dxa" w:w="1175"/>
+            <w:tcBorders>
+              <w:top w:val="single" w:color="C8D3CA" w:sz="4"/>
+              <w:left w:val="single" w:color="C8D3CA" w:sz="4"/>
+              <w:bottom w:val="single" w:color="C8D3CA" w:sz="4"/>
+              <w:right w:val="single" w:color="C8D3CA" w:sz="4"/>
+            </w:tcBorders>
+            <w:tcMar>
+              <w:top w:type="dxa" w:w="60"/>
+              <w:left w:type="dxa" w:w="100"/>
+              <w:bottom w:type="dxa" w:w="60"/>
+              <w:right w:type="dxa" w:w="100"/>
+            </w:tcMar>
+          </w:tcPr>
+          <w:p>
+            <w:r>
+              <w:rPr>
+                <w:sz w:val="19"/>
+                <w:szCs w:val="19"/>
+              </w:rPr>
+              <w:t>New</w:t>
+            </w:r>
+          </w:p>
+        </w:tc>
+        <w:tc>
+          <w:tcPr>
+            <w:tcW w:type="dxa" w:w="4701"/>
+            <w:tcBorders>
+              <w:top w:val="single" w:color="C8D3CA" w:sz="4"/>
+              <w:left w:val="single" w:color="C8D3CA" w:sz="4"/>
+              <w:bottom w:val="single" w:color="C8D3CA" w:sz="4"/>
+              <w:right w:val="single" w:color="C8D3CA" w:sz="4"/>
+            </w:tcBorders>
+            <w:tcMar>
+              <w:top w:type="dxa" w:w="60"/>
+              <w:left w:type="dxa" w:w="100"/>
+              <w:bottom w:type="dxa" w:w="60"/>
+              <w:right w:type="dxa" w:w="100"/>
+            </w:tcMar>
+          </w:tcPr>
+          <w:p>
+            <w:r>
+              <w:rPr>
+                <w:sz w:val="19"/>
+                <w:szCs w:val="19"/>
+              </w:rPr>
+              <w:t>Shortcut from quick add Spent to paying back a debt, never counted as spending.</w:t>
+            </w:r>
+          </w:p>
+        </w:tc>
+        <w:tc>
+          <w:tcPr>
+            <w:tcW w:type="dxa" w:w="1647"/>
+            <w:tcBorders>
+              <w:top w:val="single" w:color="C8D3CA" w:sz="4"/>
+              <w:left w:val="single" w:color="C8D3CA" w:sz="4"/>
+              <w:bottom w:val="single" w:color="C8D3CA" w:sz="4"/>
+              <w:right w:val="single" w:color="C8D3CA" w:sz="4"/>
+            </w:tcBorders>
+            <w:tcMar>
+              <w:top w:type="dxa" w:w="60"/>
+              <w:left w:type="dxa" w:w="100"/>
+              <w:bottom w:type="dxa" w:w="60"/>
+              <w:right w:type="dxa" w:w="100"/>
+            </w:tcMar>
+          </w:tcPr>
+          <w:p>
+            <w:r>
+              <w:rPr>
+                <w:sz w:val="19"/>
+                <w:szCs w:val="19"/>
+              </w:rPr>
+              <w:t>D-104</w:t>
             </w:r>
           </w:p>
         </w:tc>

</xml_diff>

<commit_message>
feat: Brokely's 12 pictures on Home, stage by days logged, mood by habits (D-105)
Co-Authored-By: Claude Opus 5.5 <noreply@anthropic.com>
</commit_message>
<xml_diff>
--- a/docs/requirements/Brokely_Software_Requirements_Specification_v1.7.docx
+++ b/docs/requirements/Brokely_Software_Requirements_Specification_v1.7.docx
@@ -18675,6 +18675,115 @@
                 <w:sz w:val="19"/>
                 <w:szCs w:val="19"/>
               </w:rPr>
+              <w:t>FR-MAS-09</w:t>
+            </w:r>
+          </w:p>
+        </w:tc>
+        <w:tc>
+          <w:tcPr>
+            <w:tcW w:type="dxa" w:w="6038"/>
+            <w:tcBorders>
+              <w:top w:val="single" w:color="C8D3CA" w:sz="4"/>
+              <w:left w:val="single" w:color="C8D3CA" w:sz="4"/>
+              <w:bottom w:val="single" w:color="C8D3CA" w:sz="4"/>
+              <w:right w:val="single" w:color="C8D3CA" w:sz="4"/>
+            </w:tcBorders>
+            <w:tcMar>
+              <w:top w:type="dxa" w:w="60"/>
+              <w:left w:type="dxa" w:w="100"/>
+              <w:bottom w:type="dxa" w:w="60"/>
+              <w:right w:type="dxa" w:w="100"/>
+            </w:tcMar>
+          </w:tcPr>
+          <w:p>
+            <w:r>
+              <w:rPr>
+                <w:sz w:val="19"/>
+                <w:szCs w:val="19"/>
+              </w:rPr>
+              <w:t>In 0.1 Home MUST show Brokely in one of 3 growth stages and 4 moods without XP: stage by days logged (1 below 7, 2 from 7, 3 from 30; a logged day has a record or a “No spending today” check-in; never shrinks); mood by first match: sleepy (logged before but nothing today or the 2 days before), proud (3+ logged days in a row), worried (over pace or past the budget), happy. It never changes any number (BR-26, D-105).</w:t>
+            </w:r>
+          </w:p>
+        </w:tc>
+        <w:tc>
+          <w:tcPr>
+            <w:tcW w:type="dxa" w:w="696"/>
+            <w:tcBorders>
+              <w:top w:val="single" w:color="C8D3CA" w:sz="4"/>
+              <w:left w:val="single" w:color="C8D3CA" w:sz="4"/>
+              <w:bottom w:val="single" w:color="C8D3CA" w:sz="4"/>
+              <w:right w:val="single" w:color="C8D3CA" w:sz="4"/>
+            </w:tcBorders>
+            <w:tcMar>
+              <w:top w:type="dxa" w:w="60"/>
+              <w:left w:type="dxa" w:w="100"/>
+              <w:bottom w:type="dxa" w:w="60"/>
+              <w:right w:type="dxa" w:w="100"/>
+            </w:tcMar>
+          </w:tcPr>
+          <w:p>
+            <w:r>
+              <w:rPr>
+                <w:sz w:val="19"/>
+                <w:szCs w:val="19"/>
+              </w:rPr>
+              <w:t>0.1</w:t>
+            </w:r>
+          </w:p>
+        </w:tc>
+        <w:tc>
+          <w:tcPr>
+            <w:tcW w:type="dxa" w:w="1453"/>
+            <w:tcBorders>
+              <w:top w:val="single" w:color="C8D3CA" w:sz="4"/>
+              <w:left w:val="single" w:color="C8D3CA" w:sz="4"/>
+              <w:bottom w:val="single" w:color="C8D3CA" w:sz="4"/>
+              <w:right w:val="single" w:color="C8D3CA" w:sz="4"/>
+            </w:tcBorders>
+            <w:tcMar>
+              <w:top w:type="dxa" w:w="60"/>
+              <w:left w:type="dxa" w:w="100"/>
+              <w:bottom w:type="dxa" w:w="60"/>
+              <w:right w:type="dxa" w:w="100"/>
+            </w:tcMar>
+          </w:tcPr>
+          <w:p>
+            <w:r>
+              <w:rPr>
+                <w:sz w:val="19"/>
+                <w:szCs w:val="19"/>
+              </w:rPr>
+              <w:t>AC-75</w:t>
+            </w:r>
+          </w:p>
+        </w:tc>
+      </w:tr>
+      <w:tr>
+        <w:trPr>
+          <w:cantSplit/>
+        </w:trPr>
+        <w:tc>
+          <w:tcPr>
+            <w:tcW w:type="dxa" w:w="1451"/>
+            <w:tcBorders>
+              <w:top w:val="single" w:color="C8D3CA" w:sz="4"/>
+              <w:left w:val="single" w:color="C8D3CA" w:sz="4"/>
+              <w:bottom w:val="single" w:color="C8D3CA" w:sz="4"/>
+              <w:right w:val="single" w:color="C8D3CA" w:sz="4"/>
+            </w:tcBorders>
+            <w:tcMar>
+              <w:top w:type="dxa" w:w="60"/>
+              <w:left w:type="dxa" w:w="100"/>
+              <w:bottom w:type="dxa" w:w="60"/>
+              <w:right w:type="dxa" w:w="100"/>
+            </w:tcMar>
+          </w:tcPr>
+          <w:p>
+            <w:r>
+              <w:rPr>
+                <w:sz w:val="19"/>
+                <w:szCs w:val="19"/>
+              </w:rPr>
               <w:t xml:space="preserve">FR-MAS-07</w:t>
             </w:r>
           </w:p>
@@ -31535,6 +31644,89 @@
           </w:p>
         </w:tc>
       </w:tr>
+      <w:tr>
+        <w:trPr>
+          <w:cantSplit/>
+        </w:trPr>
+        <w:tc>
+          <w:tcPr>
+            <w:tcW w:type="dxa" w:w="957"/>
+            <w:tcBorders>
+              <w:top w:val="single" w:color="C8D3CA" w:sz="4"/>
+              <w:left w:val="single" w:color="C8D3CA" w:sz="4"/>
+              <w:bottom w:val="single" w:color="C8D3CA" w:sz="4"/>
+              <w:right w:val="single" w:color="C8D3CA" w:sz="4"/>
+            </w:tcBorders>
+            <w:tcMar>
+              <w:top w:type="dxa" w:w="60"/>
+              <w:left w:type="dxa" w:w="100"/>
+              <w:bottom w:type="dxa" w:w="60"/>
+              <w:right w:type="dxa" w:w="100"/>
+            </w:tcMar>
+          </w:tcPr>
+          <w:p>
+            <w:r>
+              <w:rPr>
+                <w:sz w:val="19"/>
+                <w:szCs w:val="19"/>
+              </w:rPr>
+              <w:t>AC-75</w:t>
+            </w:r>
+          </w:p>
+        </w:tc>
+        <w:tc>
+          <w:tcPr>
+            <w:tcW w:type="dxa" w:w="4340"/>
+            <w:tcBorders>
+              <w:top w:val="single" w:color="C8D3CA" w:sz="4"/>
+              <w:left w:val="single" w:color="C8D3CA" w:sz="4"/>
+              <w:bottom w:val="single" w:color="C8D3CA" w:sz="4"/>
+              <w:right w:val="single" w:color="C8D3CA" w:sz="4"/>
+            </w:tcBorders>
+            <w:tcMar>
+              <w:top w:type="dxa" w:w="60"/>
+              <w:left w:type="dxa" w:w="100"/>
+              <w:bottom w:type="dxa" w:w="60"/>
+              <w:right w:type="dxa" w:w="100"/>
+            </w:tcMar>
+          </w:tcPr>
+          <w:p>
+            <w:r>
+              <w:rPr>
+                <w:sz w:val="19"/>
+                <w:szCs w:val="19"/>
+              </w:rPr>
+              <w:t>New student: log on 3 days in a row; then over pace with that streak; then skip 3 days; then reach 7 and 30 logged days.</w:t>
+            </w:r>
+          </w:p>
+        </w:tc>
+        <w:tc>
+          <w:tcPr>
+            <w:tcW w:type="dxa" w:w="4341"/>
+            <w:tcBorders>
+              <w:top w:val="single" w:color="C8D3CA" w:sz="4"/>
+              <w:left w:val="single" w:color="C8D3CA" w:sz="4"/>
+              <w:bottom w:val="single" w:color="C8D3CA" w:sz="4"/>
+              <w:right w:val="single" w:color="C8D3CA" w:sz="4"/>
+            </w:tcBorders>
+            <w:tcMar>
+              <w:top w:type="dxa" w:w="60"/>
+              <w:left w:type="dxa" w:w="100"/>
+              <w:bottom w:type="dxa" w:w="60"/>
+              <w:right w:type="dxa" w:w="100"/>
+            </w:tcMar>
+          </w:tcPr>
+          <w:p>
+            <w:r>
+              <w:rPr>
+                <w:sz w:val="19"/>
+                <w:szCs w:val="19"/>
+              </w:rPr>
+              <w:t>Happy at first; proud on the third day in a row, still proud while over pace; sleepy after 3 days without logging; the growing picture at 7 logged days and the full money-broccoli at 30; no amount changes.</w:t>
+            </w:r>
+          </w:p>
+        </w:tc>
+      </w:tr>
     </w:tbl>
     <w:p>
       <w:pPr>
@@ -43359,6 +43551,89 @@
                 <w:sz w:val="19"/>
                 <w:szCs w:val="19"/>
               </w:rPr>
+              <w:t>FR-MAS-09</w:t>
+            </w:r>
+          </w:p>
+        </w:tc>
+        <w:tc>
+          <w:tcPr>
+            <w:tcW w:type="dxa" w:w="1482"/>
+            <w:tcBorders>
+              <w:top w:val="single" w:color="C8D3CA" w:sz="4"/>
+              <w:left w:val="single" w:color="C8D3CA" w:sz="4"/>
+              <w:bottom w:val="single" w:color="C8D3CA" w:sz="4"/>
+              <w:right w:val="single" w:color="C8D3CA" w:sz="4"/>
+            </w:tcBorders>
+            <w:tcMar>
+              <w:top w:type="dxa" w:w="60"/>
+              <w:left w:type="dxa" w:w="100"/>
+              <w:bottom w:type="dxa" w:w="60"/>
+              <w:right w:type="dxa" w:w="100"/>
+            </w:tcMar>
+          </w:tcPr>
+          <w:p>
+            <w:r>
+              <w:rPr>
+                <w:sz w:val="19"/>
+                <w:szCs w:val="19"/>
+              </w:rPr>
+              <w:t>0.1</w:t>
+            </w:r>
+          </w:p>
+        </w:tc>
+        <w:tc>
+          <w:tcPr>
+            <w:tcW w:type="dxa" w:w="5932"/>
+            <w:tcBorders>
+              <w:top w:val="single" w:color="C8D3CA" w:sz="4"/>
+              <w:left w:val="single" w:color="C8D3CA" w:sz="4"/>
+              <w:bottom w:val="single" w:color="C8D3CA" w:sz="4"/>
+              <w:right w:val="single" w:color="C8D3CA" w:sz="4"/>
+            </w:tcBorders>
+            <w:tcMar>
+              <w:top w:type="dxa" w:w="60"/>
+              <w:left w:type="dxa" w:w="100"/>
+              <w:bottom w:type="dxa" w:w="60"/>
+              <w:right w:type="dxa" w:w="100"/>
+            </w:tcMar>
+          </w:tcPr>
+          <w:p>
+            <w:r>
+              <w:rPr>
+                <w:sz w:val="19"/>
+                <w:szCs w:val="19"/>
+              </w:rPr>
+              <w:t>AC-75</w:t>
+            </w:r>
+          </w:p>
+        </w:tc>
+      </w:tr>
+      <w:tr>
+        <w:trPr>
+          <w:cantSplit/>
+        </w:trPr>
+        <w:tc>
+          <w:tcPr>
+            <w:tcW w:type="dxa" w:w="2224"/>
+            <w:tcBorders>
+              <w:top w:val="single" w:color="C8D3CA" w:sz="4"/>
+              <w:left w:val="single" w:color="C8D3CA" w:sz="4"/>
+              <w:bottom w:val="single" w:color="C8D3CA" w:sz="4"/>
+              <w:right w:val="single" w:color="C8D3CA" w:sz="4"/>
+            </w:tcBorders>
+            <w:tcMar>
+              <w:top w:type="dxa" w:w="60"/>
+              <w:left w:type="dxa" w:w="100"/>
+              <w:bottom w:type="dxa" w:w="60"/>
+              <w:right w:type="dxa" w:w="100"/>
+            </w:tcMar>
+          </w:tcPr>
+          <w:p>
+            <w:r>
+              <w:rPr>
+                <w:sz w:val="19"/>
+                <w:szCs w:val="19"/>
+              </w:rPr>
               <w:t xml:space="preserve">FR-MAS-07</w:t>
             </w:r>
           </w:p>
@@ -43558,7 +43833,7 @@
                 <w:sz w:val="19"/>
                 <w:szCs w:val="19"/>
               </w:rPr>
-              <w:t>Every 0.1 MUST requirement passes; AC-01 to AC-30, AC-39 to AC-41, AC-47 to AC-49, AC-52 to AC-61 and AC-64 to AC-74 pass; NFR-01 to NFR-12, NFR-14, NFR-15, NFR-18 and NFR-20 to NFR-22 verified.</w:t>
+              <w:t>Every 0.1 MUST requirement passes; AC-01 to AC-30, AC-39 to AC-41, AC-47 to AC-49, AC-52 to AC-61 and AC-64 to AC-75 pass; NFR-01 to NFR-12, NFR-14, NFR-15, NFR-18 and NFR-20 to NFR-22 verified.</w:t>
             </w:r>
           </w:p>
         </w:tc>
@@ -49946,6 +50221,115 @@
                 <w:szCs w:val="19"/>
               </w:rPr>
               <w:t>D-104</w:t>
+            </w:r>
+          </w:p>
+        </w:tc>
+      </w:tr>
+      <w:tr>
+        <w:trPr>
+          <w:cantSplit/>
+        </w:trPr>
+        <w:tc>
+          <w:tcPr>
+            <w:tcW w:type="dxa" w:w="2115"/>
+            <w:tcBorders>
+              <w:top w:val="single" w:color="C8D3CA" w:sz="4"/>
+              <w:left w:val="single" w:color="C8D3CA" w:sz="4"/>
+              <w:bottom w:val="single" w:color="C8D3CA" w:sz="4"/>
+              <w:right w:val="single" w:color="C8D3CA" w:sz="4"/>
+            </w:tcBorders>
+            <w:tcMar>
+              <w:top w:type="dxa" w:w="60"/>
+              <w:left w:type="dxa" w:w="100"/>
+              <w:bottom w:type="dxa" w:w="60"/>
+              <w:right w:type="dxa" w:w="100"/>
+            </w:tcMar>
+          </w:tcPr>
+          <w:p>
+            <w:r>
+              <w:rPr>
+                <w:sz w:val="19"/>
+                <w:szCs w:val="19"/>
+              </w:rPr>
+              <w:t>FR-MAS-09, AC-75 (v1.7)</w:t>
+            </w:r>
+          </w:p>
+        </w:tc>
+        <w:tc>
+          <w:tcPr>
+            <w:tcW w:type="dxa" w:w="1175"/>
+            <w:tcBorders>
+              <w:top w:val="single" w:color="C8D3CA" w:sz="4"/>
+              <w:left w:val="single" w:color="C8D3CA" w:sz="4"/>
+              <w:bottom w:val="single" w:color="C8D3CA" w:sz="4"/>
+              <w:right w:val="single" w:color="C8D3CA" w:sz="4"/>
+            </w:tcBorders>
+            <w:tcMar>
+              <w:top w:type="dxa" w:w="60"/>
+              <w:left w:type="dxa" w:w="100"/>
+              <w:bottom w:type="dxa" w:w="60"/>
+              <w:right w:type="dxa" w:w="100"/>
+            </w:tcMar>
+          </w:tcPr>
+          <w:p>
+            <w:r>
+              <w:rPr>
+                <w:sz w:val="19"/>
+                <w:szCs w:val="19"/>
+              </w:rPr>
+              <w:t>New</w:t>
+            </w:r>
+          </w:p>
+        </w:tc>
+        <w:tc>
+          <w:tcPr>
+            <w:tcW w:type="dxa" w:w="4701"/>
+            <w:tcBorders>
+              <w:top w:val="single" w:color="C8D3CA" w:sz="4"/>
+              <w:left w:val="single" w:color="C8D3CA" w:sz="4"/>
+              <w:bottom w:val="single" w:color="C8D3CA" w:sz="4"/>
+              <w:right w:val="single" w:color="C8D3CA" w:sz="4"/>
+            </w:tcBorders>
+            <w:tcMar>
+              <w:top w:type="dxa" w:w="60"/>
+              <w:left w:type="dxa" w:w="100"/>
+              <w:bottom w:type="dxa" w:w="60"/>
+              <w:right w:type="dxa" w:w="100"/>
+            </w:tcMar>
+          </w:tcPr>
+          <w:p>
+            <w:r>
+              <w:rPr>
+                <w:sz w:val="19"/>
+                <w:szCs w:val="19"/>
+              </w:rPr>
+              <w:t>The 12 mascot pictures on Home in 0.1: stage by days logged, mood by a fixed order; XP stays in 0.2.</w:t>
+            </w:r>
+          </w:p>
+        </w:tc>
+        <w:tc>
+          <w:tcPr>
+            <w:tcW w:type="dxa" w:w="1647"/>
+            <w:tcBorders>
+              <w:top w:val="single" w:color="C8D3CA" w:sz="4"/>
+              <w:left w:val="single" w:color="C8D3CA" w:sz="4"/>
+              <w:bottom w:val="single" w:color="C8D3CA" w:sz="4"/>
+              <w:right w:val="single" w:color="C8D3CA" w:sz="4"/>
+            </w:tcBorders>
+            <w:tcMar>
+              <w:top w:type="dxa" w:w="60"/>
+              <w:left w:type="dxa" w:w="100"/>
+              <w:bottom w:type="dxa" w:w="60"/>
+              <w:right w:type="dxa" w:w="100"/>
+            </w:tcMar>
+          </w:tcPr>
+          <w:p>
+            <w:r>
+              <w:rPr>
+                <w:sz w:val="19"/>
+                <w:szCs w:val="19"/>
+              </w:rPr>
+              <w:t>D-105</w:t>
             </w:r>
           </w:p>
         </w:tc>

</xml_diff>